<commit_message>
feat: refine application pipeline docs
</commit_message>
<xml_diff>
--- a/templates/base_cover_letter_example.docx
+++ b/templates/base_cover_letter_example.docx
@@ -17,6 +17,7 @@
           <w:rFonts w:ascii="Aptos Narrow" w:cs="Aptos Narrow" w:eastAsia="Aptos Narrow" w:hAnsi="Aptos Narrow"/>
           <w:b w:val="1"/>
           <w:bCs w:val="1"/>
+          <w:color w:val="000000"/>
           <w:rtl w:val="0"/>
         </w:rPr>
         <w:t xml:space="preserve">Mr Lucas PERTUSA</w:t>
@@ -33,6 +34,7 @@
       <w:r>
         <w:rPr>
           <w:rFonts w:ascii="Aptos Narrow" w:cs="Aptos Narrow" w:eastAsia="Aptos Narrow" w:hAnsi="Aptos Narrow"/>
+          <w:color w:val="000000"/>
           <w:rtl w:val="0"/>
         </w:rPr>
         <w:t xml:space="preserve">1 Place des Bannes</w:t>
@@ -49,6 +51,7 @@
       <w:r>
         <w:rPr>
           <w:rFonts w:ascii="Aptos Narrow" w:cs="Aptos Narrow" w:eastAsia="Aptos Narrow" w:hAnsi="Aptos Narrow"/>
+          <w:color w:val="000000"/>
           <w:rtl w:val="0"/>
         </w:rPr>
         <w:t xml:space="preserve">27710 St Georges Motel</w:t>
@@ -65,6 +68,7 @@
       <w:r>
         <w:rPr>
           <w:rFonts w:ascii="Aptos Narrow" w:cs="Aptos Narrow" w:eastAsia="Aptos Narrow" w:hAnsi="Aptos Narrow"/>
+          <w:color w:val="000000"/>
           <w:rtl w:val="0"/>
         </w:rPr>
         <w:t xml:space="preserve">tel : 07.66.40.32.00</w:t>
@@ -81,6 +85,7 @@
       <w:r>
         <w:rPr>
           <w:rFonts w:ascii="Aptos Narrow" w:cs="Aptos Narrow" w:eastAsia="Aptos Narrow" w:hAnsi="Aptos Narrow"/>
+          <w:color w:val="000000"/>
           <w:rtl w:val="0"/>
         </w:rPr>
         <w:t xml:space="preserve">email : </w:t>
@@ -98,6 +103,7 @@
       </w:hyperlink>
       <w:r>
         <w:rPr>
+          <w:color w:val="000000"/>
           <w:rtl w:val="0"/>
         </w:rPr>
       </w:r>
@@ -106,37 +112,31 @@
       <w:pPr>
         <w:spacing w:after="240" w:before="240" w:lineRule="auto"/>
         <w:ind w:right="-749"/>
-        <w:rPr>
-          <w:rFonts w:ascii="Aptos Narrow" w:cs="Aptos Narrow" w:eastAsia="Aptos Narrow" w:hAnsi="Aptos Narrow"/>
-        </w:rPr>
-      </w:pPr>
-      <w:r>
-        <w:rPr>
-          <w:rFonts w:ascii="Aptos Narrow" w:cs="Aptos Narrow" w:eastAsia="Aptos Narrow" w:hAnsi="Aptos Narrow"/>
-          <w:rtl w:val="0"/>
-        </w:rPr>
-        <w:tab/>
-        <w:tab/>
-        <w:tab/>
-        <w:tab/>
-        <w:tab/>
-        <w:tab/>
-        <w:tab/>
-        <w:t xml:space="preserve">à</w:t>
-        <w:tab/>
-        <w:tab/>
+        <w:jc w:val="right"/>
+        <w:rPr>
+          <w:rFonts w:ascii="Aptos Narrow" w:cs="Aptos Narrow" w:eastAsia="Aptos Narrow" w:hAnsi="Aptos Narrow"/>
+        </w:rPr>
+      </w:pPr>
+      <w:r>
+        <w:rPr>
+          <w:rFonts w:ascii="Aptos Narrow" w:cs="Aptos Narrow" w:eastAsia="Aptos Narrow" w:hAnsi="Aptos Narrow"/>
+          <w:color w:val="000000"/>
+          <w:rtl w:val="0"/>
+        </w:rPr>
+        <w:t>À [[LM_COMPANY]]</w:t>
       </w:r>
       <w:r>
         <w:rPr>
           <w:rFonts w:ascii="Aptos Narrow" w:cs="Aptos Narrow" w:eastAsia="Aptos Narrow" w:hAnsi="Aptos Narrow"/>
           <w:b w:val="1"/>
           <w:bCs w:val="1"/>
-          <w:rtl w:val="0"/>
-        </w:rPr>
-        <w:t xml:space="preserve">[[LM_COMPANY]]</w:t>
-      </w:r>
-      <w:r>
-        <w:rPr>
+          <w:color w:val="000000"/>
+          <w:rtl w:val="0"/>
+        </w:rPr>
+      </w:r>
+      <w:r>
+        <w:rPr>
+          <w:color w:val="000000"/>
           <w:rtl w:val="0"/>
         </w:rPr>
       </w:r>
@@ -145,13 +145,15 @@
       <w:pPr>
         <w:spacing w:after="240" w:before="240" w:lineRule="auto"/>
         <w:ind w:left="5760" w:right="-749" w:firstLine="0"/>
-        <w:rPr>
-          <w:rFonts w:ascii="Aptos Narrow" w:cs="Aptos Narrow" w:eastAsia="Aptos Narrow" w:hAnsi="Aptos Narrow"/>
-        </w:rPr>
-      </w:pPr>
-      <w:r>
-        <w:rPr>
-          <w:rFonts w:ascii="Aptos Narrow" w:cs="Aptos Narrow" w:eastAsia="Aptos Narrow" w:hAnsi="Aptos Narrow"/>
+        <w:jc w:val="right"/>
+        <w:rPr>
+          <w:rFonts w:ascii="Aptos Narrow" w:cs="Aptos Narrow" w:eastAsia="Aptos Narrow" w:hAnsi="Aptos Narrow"/>
+        </w:rPr>
+      </w:pPr>
+      <w:r>
+        <w:rPr>
+          <w:rFonts w:ascii="Aptos Narrow" w:cs="Aptos Narrow" w:eastAsia="Aptos Narrow" w:hAnsi="Aptos Narrow"/>
+          <w:color w:val="000000"/>
           <w:rtl w:val="0"/>
         </w:rPr>
         <w:t xml:space="preserve">[[LM_COMPANY_ADDRESS_LINE_1]]</w:t>
@@ -161,7 +163,7 @@
       <w:pPr>
         <w:spacing w:line="240" w:lineRule="auto"/>
         <w:ind w:right="-748" w:firstLine="720"/>
-        <w:jc w:val="center"/>
+        <w:jc w:val="right"/>
         <w:rPr>
           <w:rFonts w:ascii="Aptos Narrow" w:cs="Aptos Narrow" w:eastAsia="Aptos Narrow" w:hAnsi="Aptos Narrow"/>
           <w:b w:val="1"/>
@@ -173,10 +175,11 @@
       <w:r>
         <w:rPr>
           <w:rFonts w:ascii="Aptos Narrow" w:cs="Aptos Narrow" w:eastAsia="Aptos Narrow" w:hAnsi="Aptos Narrow"/>
-          <w:b w:val="1"/>
+          <w:b w:val="0"/>
           <w:bCs w:val="1"/>
-          <w:i w:val="1"/>
+          <w:i w:val="0"/>
           <w:iCs w:val="1"/>
+          <w:color w:val="000000"/>
           <w:rtl w:val="0"/>
         </w:rPr>
         <w:t xml:space="preserve">               </w:t>
@@ -204,6 +207,7 @@
       </w:pPr>
       <w:r>
         <w:rPr>
+          <w:color w:val="000000"/>
           <w:rtl w:val="0"/>
         </w:rPr>
       </w:r>
@@ -223,6 +227,7 @@
       </w:pPr>
       <w:r>
         <w:rPr>
+          <w:color w:val="000000"/>
           <w:rtl w:val="0"/>
         </w:rPr>
       </w:r>
@@ -246,6 +251,7 @@
           <w:bCs w:val="1"/>
           <w:i w:val="1"/>
           <w:iCs w:val="1"/>
+          <w:color w:val="000000"/>
           <w:rtl w:val="0"/>
         </w:rPr>
         <w:t xml:space="preserve">A l’attention des ressources humaines</w:t>
@@ -266,6 +272,7 @@
           <w:rFonts w:ascii="Aptos Narrow" w:cs="Aptos Narrow" w:eastAsia="Aptos Narrow" w:hAnsi="Aptos Narrow"/>
           <w:i w:val="1"/>
           <w:iCs w:val="1"/>
+          <w:color w:val="000000"/>
           <w:rtl w:val="0"/>
         </w:rPr>
         <w:t xml:space="preserve">[[LM_DEPARTMENT]]</w:t>
@@ -274,26 +281,33 @@
     <w:p>
       <w:pPr>
         <w:spacing w:after="240" w:before="240" w:lineRule="auto"/>
-        <w:ind w:right="-749"/>
-        <w:rPr>
-          <w:rFonts w:ascii="Aptos Narrow" w:cs="Aptos Narrow" w:eastAsia="Aptos Narrow" w:hAnsi="Aptos Narrow"/>
-        </w:rPr>
-      </w:pPr>
-      <w:r>
-        <w:rPr>
-          <w:rFonts w:ascii="Aptos Narrow" w:cs="Aptos Narrow" w:eastAsia="Aptos Narrow" w:hAnsi="Aptos Narrow"/>
-          <w:rtl w:val="0"/>
-        </w:rPr>
-        <w:t xml:space="preserve">Chère Madame,</w:t>
-        <w:tab/>
-        <w:tab/>
-        <w:tab/>
-        <w:tab/>
-        <w:tab/>
-        <w:tab/>
-        <w:tab/>
-        <w:tab/>
-        <w:tab/>
+        <w:rPr>
+          <w:rFonts w:ascii="Aptos Narrow" w:cs="Aptos Narrow" w:eastAsia="Aptos Narrow" w:hAnsi="Aptos Narrow"/>
+        </w:rPr>
+      </w:pPr>
+      <w:r>
+        <w:rPr>
+          <w:rFonts w:ascii="Aptos Narrow" w:cs="Aptos Narrow" w:eastAsia="Aptos Narrow" w:hAnsi="Aptos Narrow"/>
+          <w:color w:val="000000"/>
+          <w:rtl w:val="0"/>
+        </w:rPr>
+        <w:t xml:space="preserve">[[LM_SALUTATION]],</w:t>
+      </w:r>
+    </w:p>
+    <w:p>
+      <w:pPr>
+        <w:spacing w:after="160" w:before="240" w:lineRule="auto"/>
+        <w:rPr>
+          <w:rFonts w:ascii="Aptos Narrow" w:cs="Aptos Narrow" w:eastAsia="Aptos Narrow" w:hAnsi="Aptos Narrow"/>
+        </w:rPr>
+      </w:pPr>
+      <w:r>
+        <w:rPr>
+          <w:rFonts w:ascii="Aptos Narrow" w:cs="Aptos Narrow" w:eastAsia="Aptos Narrow" w:hAnsi="Aptos Narrow"/>
+          <w:color w:val="000000"/>
+          <w:rtl w:val="0"/>
+        </w:rPr>
+        <w:t xml:space="preserve">[[LM_FINAL_LETTER]]</w:t>
       </w:r>
     </w:p>
     <w:p>
@@ -306,36 +320,7 @@
       <w:r>
         <w:rPr>
           <w:rFonts w:ascii="Aptos Narrow" w:cs="Aptos Narrow" w:eastAsia="Aptos Narrow" w:hAnsi="Aptos Narrow"/>
-          <w:rtl w:val="0"/>
-        </w:rPr>
-        <w:t xml:space="preserve">[[LM_SALUTATION]],</w:t>
-      </w:r>
-    </w:p>
-    <w:p>
-      <w:pPr>
-        <w:spacing w:after="240" w:before="240" w:lineRule="auto"/>
-        <w:rPr>
-          <w:rFonts w:ascii="Aptos Narrow" w:cs="Aptos Narrow" w:eastAsia="Aptos Narrow" w:hAnsi="Aptos Narrow"/>
-        </w:rPr>
-      </w:pPr>
-      <w:r>
-        <w:rPr>
-          <w:rFonts w:ascii="Aptos Narrow" w:cs="Aptos Narrow" w:eastAsia="Aptos Narrow" w:hAnsi="Aptos Narrow"/>
-          <w:rtl w:val="0"/>
-        </w:rPr>
-        <w:t xml:space="preserve">[[LM_FINAL_LETTER]]</w:t>
-      </w:r>
-    </w:p>
-    <w:p>
-      <w:pPr>
-        <w:spacing w:after="240" w:before="240" w:lineRule="auto"/>
-        <w:rPr>
-          <w:rFonts w:ascii="Aptos Narrow" w:cs="Aptos Narrow" w:eastAsia="Aptos Narrow" w:hAnsi="Aptos Narrow"/>
-        </w:rPr>
-      </w:pPr>
-      <w:r>
-        <w:rPr>
-          <w:rFonts w:ascii="Aptos Narrow" w:cs="Aptos Narrow" w:eastAsia="Aptos Narrow" w:hAnsi="Aptos Narrow"/>
+          <w:color w:val="000000"/>
           <w:rtl w:val="0"/>
         </w:rPr>
         <w:t xml:space="preserve">Le [[LM_DATE]]</w:t>
@@ -350,6 +335,7 @@
       <w:r>
         <w:rPr>
           <w:rFonts w:ascii="Open Sans" w:cs="Open Sans" w:eastAsia="Open Sans" w:hAnsi="Open Sans"/>
+          <w:color w:val="000000"/>
           <w:rtl w:val="0"/>
         </w:rPr>
         <w:t xml:space="preserve">Lucas pertusa </w:t>

</xml_diff>